<commit_message>
docs: agregar anexo B con documentos del repositorio
</commit_message>
<xml_diff>
--- a/Plan_DevOps_AquaSoft.docx
+++ b/Plan_DevOps_AquaSoft.docx
@@ -38638,6 +38638,374 @@
       </w:tr>
     </w:tbl>
     <w:p/>
+    <w:p>
+      <w:pPr>
+        <w:pStyle w:val="Ttulo1"/>
+      </w:pPr>
+      <w:r>
+        <w:rPr>
+          <w:color w:val="1F3864"/>
+        </w:rPr>
+        <w:t>7. Anexos</w:t>
+      </w:r>
+    </w:p>
+    <w:p>
+      <w:r>
+        <w:rPr>
+          <w:b w:val="0"/>
+          <w:i w:val="0"/>
+          <w:sz w:val="22"/>
+        </w:rPr>
+        <w:t>Documentos que conforman el repositorio de documentacion del proyecto AquaSoft (CafeSoft), disponibles en https://github.com/alanronaldosc-dev/Documentacion-AquaSoft</w:t>
+      </w:r>
+    </w:p>
+    <w:tbl>
+      <w:tblPr>
+        <w:tblStyle w:val="Tablaconcuadrcula"/>
+        <w:tblW w:type="auto" w:w="0"/>
+        <w:jc w:val="center"/>
+        <w:tblLook w:firstColumn="1" w:firstRow="1" w:lastColumn="0" w:lastRow="0" w:noHBand="0" w:noVBand="1" w:val="04A0"/>
+      </w:tblPr>
+      <w:tblGrid>
+        <w:gridCol w:w="2880"/>
+        <w:gridCol w:w="2880"/>
+        <w:gridCol w:w="2880"/>
+      </w:tblGrid>
+      <w:tr>
+        <w:tc>
+          <w:tcPr>
+            <w:tcW w:type="dxa" w:w="2880"/>
+            <w:shd w:val="clear" w:color="auto" w:fill="1F3864"/>
+          </w:tcPr>
+          <w:p>
+            <w:r/>
+            <w:r>
+              <w:rPr>
+                <w:b/>
+                <w:color w:val="FFFFFF"/>
+                <w:sz w:val="20"/>
+              </w:rPr>
+              <w:t>Documento</w:t>
+            </w:r>
+          </w:p>
+        </w:tc>
+        <w:tc>
+          <w:tcPr>
+            <w:tcW w:type="dxa" w:w="2880"/>
+            <w:shd w:val="clear" w:color="auto" w:fill="1F3864"/>
+          </w:tcPr>
+          <w:p>
+            <w:r/>
+            <w:r>
+              <w:rPr>
+                <w:b/>
+                <w:color w:val="FFFFFF"/>
+                <w:sz w:val="20"/>
+              </w:rPr>
+              <w:t>Descripcion</w:t>
+            </w:r>
+          </w:p>
+        </w:tc>
+        <w:tc>
+          <w:tcPr>
+            <w:tcW w:type="dxa" w:w="2880"/>
+            <w:shd w:val="clear" w:color="auto" w:fill="1F3864"/>
+          </w:tcPr>
+          <w:p>
+            <w:r/>
+            <w:r>
+              <w:rPr>
+                <w:b/>
+                <w:color w:val="FFFFFF"/>
+                <w:sz w:val="20"/>
+              </w:rPr>
+              <w:t>Ubicacion</w:t>
+            </w:r>
+          </w:p>
+        </w:tc>
+      </w:tr>
+      <w:tr>
+        <w:tc>
+          <w:tcPr>
+            <w:tcW w:type="dxa" w:w="2880"/>
+          </w:tcPr>
+          <w:p>
+            <w:r/>
+            <w:r>
+              <w:rPr>
+                <w:b/>
+                <w:sz w:val="18"/>
+              </w:rPr>
+              <w:t>PBL_AquaSoft.xlsx</w:t>
+            </w:r>
+          </w:p>
+        </w:tc>
+        <w:tc>
+          <w:tcPr>
+            <w:tcW w:type="dxa" w:w="2880"/>
+          </w:tcPr>
+          <w:p>
+            <w:r/>
+            <w:r>
+              <w:rPr>
+                <w:sz w:val="18"/>
+              </w:rPr>
+              <w:t>Product Backlog general, HU planeadas por sprint, requerimientos funcionales y no funcionales, plan de iteraciones, matriz de esfuerzo, plan de pruebas (niveles, casos, cronograma Gantt) y plan DevOps (5 hojas).</w:t>
+            </w:r>
+          </w:p>
+        </w:tc>
+        <w:tc>
+          <w:tcPr>
+            <w:tcW w:type="dxa" w:w="2880"/>
+          </w:tcPr>
+          <w:p>
+            <w:r/>
+            <w:r>
+              <w:rPr>
+                <w:sz w:val="18"/>
+              </w:rPr>
+              <w:t>Repositorio Documentacion-AquaSoft</w:t>
+            </w:r>
+          </w:p>
+        </w:tc>
+      </w:tr>
+      <w:tr>
+        <w:tc>
+          <w:tcPr>
+            <w:tcW w:type="dxa" w:w="2880"/>
+          </w:tcPr>
+          <w:p>
+            <w:r/>
+            <w:r>
+              <w:rPr>
+                <w:b/>
+                <w:sz w:val="18"/>
+              </w:rPr>
+              <w:t>Plan_DevOps_AquaSoft.docx</w:t>
+            </w:r>
+          </w:p>
+        </w:tc>
+        <w:tc>
+          <w:tcPr>
+            <w:tcW w:type="dxa" w:w="2880"/>
+          </w:tcPr>
+          <w:p>
+            <w:r/>
+            <w:r>
+              <w:rPr>
+                <w:sz w:val="18"/>
+              </w:rPr>
+              <w:t>Plan DevOps completo: objetivos, metodologia (Scrum), herramientas, control de versiones, pruebas, estrategia de despliegue (Rolling), pasos de despliegue, monitoreo, glosario.</w:t>
+            </w:r>
+          </w:p>
+        </w:tc>
+        <w:tc>
+          <w:tcPr>
+            <w:tcW w:type="dxa" w:w="2880"/>
+          </w:tcPr>
+          <w:p>
+            <w:r/>
+            <w:r>
+              <w:rPr>
+                <w:sz w:val="18"/>
+              </w:rPr>
+              <w:t>Repositorio Documentacion-AquaSoft</w:t>
+            </w:r>
+          </w:p>
+        </w:tc>
+      </w:tr>
+      <w:tr>
+        <w:tc>
+          <w:tcPr>
+            <w:tcW w:type="dxa" w:w="2880"/>
+          </w:tcPr>
+          <w:p>
+            <w:r/>
+            <w:r>
+              <w:rPr>
+                <w:b/>
+                <w:sz w:val="18"/>
+              </w:rPr>
+              <w:t>Plan_Despliegue_AquaSoft.docx</w:t>
+            </w:r>
+          </w:p>
+        </w:tc>
+        <w:tc>
+          <w:tcPr>
+            <w:tcW w:type="dxa" w:w="2880"/>
+          </w:tcPr>
+          <w:p>
+            <w:r/>
+            <w:r>
+              <w:rPr>
+                <w:sz w:val="18"/>
+              </w:rPr>
+              <w:t>Documento dedicado al proceso de despliegue: portada, indice, glosario, estrategia de despliegue, pasos administrativos, registro de releases con fechas, monitoreo y aprobaciones.</w:t>
+            </w:r>
+          </w:p>
+        </w:tc>
+        <w:tc>
+          <w:tcPr>
+            <w:tcW w:type="dxa" w:w="2880"/>
+          </w:tcPr>
+          <w:p>
+            <w:r/>
+            <w:r>
+              <w:rPr>
+                <w:sz w:val="18"/>
+              </w:rPr>
+              <w:t>Repositorio Documentacion-AquaSoft</w:t>
+            </w:r>
+          </w:p>
+        </w:tc>
+      </w:tr>
+      <w:tr>
+        <w:tc>
+          <w:tcPr>
+            <w:tcW w:type="dxa" w:w="2880"/>
+          </w:tcPr>
+          <w:p>
+            <w:r/>
+            <w:r>
+              <w:rPr>
+                <w:b/>
+                <w:sz w:val="18"/>
+              </w:rPr>
+              <w:t>Pruebas_Unitarias_UT.docx</w:t>
+            </w:r>
+          </w:p>
+        </w:tc>
+        <w:tc>
+          <w:tcPr>
+            <w:tcW w:type="dxa" w:w="2880"/>
+          </w:tcPr>
+          <w:p>
+            <w:r/>
+            <w:r>
+              <w:rPr>
+                <w:sz w:val="18"/>
+              </w:rPr>
+              <w:t>Casos de pruebas unitarias por modulo (JUnit, Vitest, Jest). Sin fechas de ejecucion asignadas.</w:t>
+            </w:r>
+          </w:p>
+        </w:tc>
+        <w:tc>
+          <w:tcPr>
+            <w:tcW w:type="dxa" w:w="2880"/>
+          </w:tcPr>
+          <w:p>
+            <w:r/>
+            <w:r>
+              <w:rPr>
+                <w:sz w:val="18"/>
+              </w:rPr>
+              <w:t>Repositorio Documentacion-AquaSoft</w:t>
+            </w:r>
+          </w:p>
+        </w:tc>
+      </w:tr>
+      <w:tr>
+        <w:tc>
+          <w:tcPr>
+            <w:tcW w:type="dxa" w:w="2880"/>
+          </w:tcPr>
+          <w:p>
+            <w:r/>
+            <w:r>
+              <w:rPr>
+                <w:b/>
+                <w:sz w:val="18"/>
+              </w:rPr>
+              <w:t>Pruebas_Aceptacion_UAT.docx</w:t>
+            </w:r>
+          </w:p>
+        </w:tc>
+        <w:tc>
+          <w:tcPr>
+            <w:tcW w:type="dxa" w:w="2880"/>
+          </w:tcPr>
+          <w:p>
+            <w:r/>
+            <w:r>
+              <w:rPr>
+                <w:sz w:val="18"/>
+              </w:rPr>
+              <w:t>Casos de aceptacion del usuario (UAT-01 a UAT-20) y calendario de ejecucion (12-23 oct 2026).</w:t>
+            </w:r>
+          </w:p>
+        </w:tc>
+        <w:tc>
+          <w:tcPr>
+            <w:tcW w:type="dxa" w:w="2880"/>
+          </w:tcPr>
+          <w:p>
+            <w:r/>
+            <w:r>
+              <w:rPr>
+                <w:sz w:val="18"/>
+              </w:rPr>
+              <w:t>Repositorio Documentacion-AquaSoft</w:t>
+            </w:r>
+          </w:p>
+        </w:tc>
+      </w:tr>
+      <w:tr>
+        <w:tc>
+          <w:tcPr>
+            <w:tcW w:type="dxa" w:w="2880"/>
+          </w:tcPr>
+          <w:p>
+            <w:r/>
+            <w:r>
+              <w:rPr>
+                <w:b/>
+                <w:sz w:val="18"/>
+              </w:rPr>
+              <w:t>Pruebas_OAT.docx</w:t>
+            </w:r>
+          </w:p>
+        </w:tc>
+        <w:tc>
+          <w:tcPr>
+            <w:tcW w:type="dxa" w:w="2880"/>
+          </w:tcPr>
+          <w:p>
+            <w:r/>
+            <w:r>
+              <w:rPr>
+                <w:sz w:val="18"/>
+              </w:rPr>
+              <w:t>Pruebas operacionales: despliegue, seguridad, rendimiento, disponibilidad (ventana 12-14 oct 2026).</w:t>
+            </w:r>
+          </w:p>
+        </w:tc>
+        <w:tc>
+          <w:tcPr>
+            <w:tcW w:type="dxa" w:w="2880"/>
+          </w:tcPr>
+          <w:p>
+            <w:r/>
+            <w:r>
+              <w:rPr>
+                <w:sz w:val="18"/>
+              </w:rPr>
+              <w:t>Repositorio Documentacion-AquaSoft</w:t>
+            </w:r>
+          </w:p>
+        </w:tc>
+      </w:tr>
+    </w:tbl>
+    <w:p/>
+    <w:p>
+      <w:r>
+        <w:rPr>
+          <w:b w:val="0"/>
+          <w:i/>
+          <w:sz w:val="18"/>
+        </w:rPr>
+        <w:t>Nota: Estos documentos se mantienen versionados en el repositorio de GitHub Documentacion-AquaSoft. Cualquier actualizacion debe reflejarse en el repositorio y en este anexo.</w:t>
+      </w:r>
+    </w:p>
     <w:sectPr>
       <w:pgSz w:w="12240" w:h="15840"/>
       <w:pgMar w:top="1440" w:right="1800" w:bottom="1440" w:left="1800" w:header="720" w:footer="720" w:gutter="0"/>

</xml_diff>